<commit_message>
Metadata and minor fixes
</commit_message>
<xml_diff>
--- a/docassemble/MLRITenantAccommodationsRequest/data/templates/accommodationrequestletter_next_steps.docx
+++ b/docassemble/MLRITenantAccommodationsRequest/data/templates/accommodationrequestletter_next_steps.docx
@@ -31,10 +31,7 @@
               <w:jc w:val="center"/>
             </w:pPr>
             <w:r>
-              <w:rPr>
-                <w:color w:val="FFFFFF" w:themeColor="background1"/>
-              </w:rPr>
-              <w:t>Write a letter to request housing accommodations for a disabled person.</w:t>
+              <w:t>Write a letter to request housing accommodations for a person with a disability.</w:t>
             </w:r>
           </w:p>
         </w:tc>
@@ -50,43 +47,7 @@
     </w:p>
     <w:p>
       <w:r>
-        <w:t xml:space="preserve">Congratulations </w:t>
-      </w:r>
-      <w:r>
-        <w:t>{{</w:t>
-      </w:r>
-      <w:r>
-        <w:t xml:space="preserve"> users </w:t>
-      </w:r>
-      <w:r>
-        <w:t>}}</w:t>
-      </w:r>
-      <w:r>
-        <w:t xml:space="preserve">! You have finished all the forms you need to Write a letter to request housing accommodations for a disabled person. The rest of the pages in this packet are your </w:t>
-      </w:r>
-      <w:r>
-        <w:t xml:space="preserve">letter </w:t>
-      </w:r>
-      <w:r>
-        <w:t xml:space="preserve">to </w:t>
-      </w:r>
-      <w:r>
-        <w:t>{{</w:t>
-      </w:r>
-      <w:r>
-        <w:t xml:space="preserve"> </w:t>
-      </w:r>
-      <w:r>
-        <w:t>landlords</w:t>
-      </w:r>
-      <w:r>
-        <w:t xml:space="preserve"> </w:t>
-      </w:r>
-      <w:r>
-        <w:t>}}</w:t>
-      </w:r>
-      <w:r>
-        <w:t>.</w:t>
+        <w:t>Congratulations {{ users }}! You have finished all the forms you need to write a letter to request housing accommodations for a person with a disability. The rest of the pages in this packet are your letter to {{ landlords }}.</w:t>
       </w:r>
     </w:p>
     <w:p/>
@@ -248,63 +209,7 @@
         </w:rPr>
       </w:pPr>
       <w:r>
-        <w:rPr>
-          <w14:textOutline w14:w="9525" w14:cap="rnd" w14:cmpd="sng" w14:algn="ctr">
-            <w14:noFill/>
-            <w14:prstDash w14:val="solid"/>
-            <w14:bevel/>
-          </w14:textOutline>
-        </w:rPr>
-        <w:t xml:space="preserve">If </w:t>
-      </w:r>
-      <w:r>
-        <w:rPr>
-          <w14:textOutline w14:w="9525" w14:cap="rnd" w14:cmpd="sng" w14:algn="ctr">
-            <w14:noFill/>
-            <w14:prstDash w14:val="solid"/>
-            <w14:bevel/>
-          </w14:textOutline>
-        </w:rPr>
-        <w:t xml:space="preserve">{{ </w:t>
-      </w:r>
-      <w:r>
-        <w:rPr>
-          <w14:textOutline w14:w="9525" w14:cap="rnd" w14:cmpd="sng" w14:algn="ctr">
-            <w14:noFill/>
-            <w14:prstDash w14:val="solid"/>
-            <w14:bevel/>
-          </w14:textOutline>
-        </w:rPr>
-        <w:t>landlords</w:t>
-      </w:r>
-      <w:r>
-        <w:rPr>
-          <w14:textOutline w14:w="9525" w14:cap="rnd" w14:cmpd="sng" w14:algn="ctr">
-            <w14:noFill/>
-            <w14:prstDash w14:val="solid"/>
-            <w14:bevel/>
-          </w14:textOutline>
-        </w:rPr>
-        <w:t xml:space="preserve"> </w:t>
-      </w:r>
-      <w:r>
-        <w:rPr>
-          <w14:textOutline w14:w="9525" w14:cap="rnd" w14:cmpd="sng" w14:algn="ctr">
-            <w14:noFill/>
-            <w14:prstDash w14:val="solid"/>
-            <w14:bevel/>
-          </w14:textOutline>
-        </w:rPr>
-        <w:t>}}</w:t>
-      </w:r>
-      <w:r>
-        <w:t xml:space="preserve"> does not answer your letter within 30 days,</w:t>
-      </w:r>
-      <w:r>
-        <w:t xml:space="preserve"> </w:t>
-      </w:r>
-      <w:r>
-        <w:t>contact them again to make sure they received your request.</w:t>
+        <w:t>If {{ landlords }} does not answer your letter within 10 days, contact them again to make sure they received your request.</w:t>
       </w:r>
     </w:p>
     <w:p>
@@ -367,13 +272,7 @@
         <w:ind w:left="720"/>
       </w:pPr>
       <w:r>
-        <w:t xml:space="preserve">Send an email to your landlord or property management company and attach the signed letter, </w:t>
-      </w:r>
-      <w:r>
-        <w:t>or</w:t>
-      </w:r>
-      <w:r>
-        <w:t>;</w:t>
+        <w:t>Send an email to your landlord or property management company and attach the signed letter, or</w:t>
       </w:r>
     </w:p>
     <w:p>
@@ -419,13 +318,7 @@
         <w:ind w:left="360"/>
       </w:pPr>
       <w:r>
-        <w:t>Your landlord will review your request and should respond within</w:t>
-      </w:r>
-      <w:r>
-        <w:t xml:space="preserve"> about</w:t>
-      </w:r>
-      <w:r>
-        <w:t xml:space="preserve"> two (2) weeks.</w:t>
+        <w:t>Your landlord will review your request and should respond within about 10 days.</w:t>
       </w:r>
     </w:p>
     <w:p>
@@ -459,56 +352,7 @@
         <w:pStyle w:val="Heading2"/>
       </w:pPr>
       <w:r>
-        <w:t xml:space="preserve">What do I do if  </w:t>
-      </w:r>
-      <w:r>
-        <w:t>{{</w:t>
-      </w:r>
-      <w:r>
-        <w:rPr>
-          <w14:textOutline w14:w="9525" w14:cap="rnd" w14:cmpd="sng" w14:algn="ctr">
-            <w14:noFill/>
-            <w14:prstDash w14:val="solid"/>
-            <w14:bevel/>
-          </w14:textOutline>
-        </w:rPr>
-        <w:t xml:space="preserve"> </w:t>
-      </w:r>
-      <w:r>
-        <w:rPr>
-          <w14:textOutline w14:w="9525" w14:cap="rnd" w14:cmpd="sng" w14:algn="ctr">
-            <w14:noFill/>
-            <w14:prstDash w14:val="solid"/>
-            <w14:bevel/>
-          </w14:textOutline>
-        </w:rPr>
-        <w:t>landlords</w:t>
-      </w:r>
-      <w:r>
-        <w:rPr>
-          <w14:textOutline w14:w="9525" w14:cap="rnd" w14:cmpd="sng" w14:algn="ctr">
-            <w14:noFill/>
-            <w14:prstDash w14:val="solid"/>
-            <w14:bevel/>
-          </w14:textOutline>
-        </w:rPr>
-        <w:t xml:space="preserve"> </w:t>
-      </w:r>
-      <w:r>
-        <w:rPr>
-          <w14:textOutline w14:w="9525" w14:cap="rnd" w14:cmpd="sng" w14:algn="ctr">
-            <w14:noFill/>
-            <w14:prstDash w14:val="solid"/>
-            <w14:bevel/>
-          </w14:textOutline>
-        </w:rPr>
-        <w:t>}}</w:t>
-      </w:r>
-      <w:r>
-        <w:t xml:space="preserve"> </w:t>
-      </w:r>
-      <w:r>
-        <w:t xml:space="preserve"> ignores my letter?</w:t>
+        <w:t>What do I do if {{ landlords }} ignores my letter?</w:t>
       </w:r>
     </w:p>
     <w:p>

</xml_diff>

<commit_message>
Fix contrast in next steps doc
</commit_message>
<xml_diff>
--- a/docassemble/MLRITenantAccommodationsRequest/data/templates/accommodationrequestletter_next_steps.docx
+++ b/docassemble/MLRITenantAccommodationsRequest/data/templates/accommodationrequestletter_next_steps.docx
@@ -1,6 +1,6 @@
 
 <file path=word/document.xml><?xml version="1.0" encoding="utf-8"?>
-<w:document xmlns:wpc="http://schemas.microsoft.com/office/word/2010/wordprocessingCanvas" xmlns:cx="http://schemas.microsoft.com/office/drawing/2014/chartex" xmlns:cx1="http://schemas.microsoft.com/office/drawing/2015/9/8/chartex" xmlns:cx2="http://schemas.microsoft.com/office/drawing/2015/10/21/chartex" xmlns:cx3="http://schemas.microsoft.com/office/drawing/2016/5/9/chartex" xmlns:cx4="http://schemas.microsoft.com/office/drawing/2016/5/10/chartex" xmlns:cx5="http://schemas.microsoft.com/office/drawing/2016/5/11/chartex" xmlns:cx6="http://schemas.microsoft.com/office/drawing/2016/5/12/chartex" xmlns:cx7="http://schemas.microsoft.com/office/drawing/2016/5/13/chartex" xmlns:cx8="http://schemas.microsoft.com/office/drawing/2016/5/14/chartex" xmlns:mc="http://schemas.openxmlformats.org/markup-compatibility/2006" xmlns:aink="http://schemas.microsoft.com/office/drawing/2016/ink" xmlns:am3d="http://schemas.microsoft.com/office/drawing/2017/model3d" xmlns:o="urn:schemas-microsoft-com:office:office" xmlns:oel="http://schemas.microsoft.com/office/2019/extlst" xmlns:r="http://schemas.openxmlformats.org/officeDocument/2006/relationships" xmlns:m="http://schemas.openxmlformats.org/officeDocument/2006/math" xmlns:v="urn:schemas-microsoft-com:vml" xmlns:wp14="http://schemas.microsoft.com/office/word/2010/wordprocessingDrawing" xmlns:wp="http://schemas.openxmlformats.org/drawingml/2006/wordprocessingDrawing" xmlns:w10="urn:schemas-microsoft-com:office:word" xmlns:w="http://schemas.openxmlformats.org/wordprocessingml/2006/main" xmlns:w14="http://schemas.microsoft.com/office/word/2010/wordml" xmlns:w15="http://schemas.microsoft.com/office/word/2012/wordml" xmlns:w16cex="http://schemas.microsoft.com/office/word/2018/wordml/cex" xmlns:w16cid="http://schemas.microsoft.com/office/word/2016/wordml/cid" xmlns:w16="http://schemas.microsoft.com/office/word/2018/wordml" xmlns:w16du="http://schemas.microsoft.com/office/word/2023/wordml/word16du" xmlns:w16sdtdh="http://schemas.microsoft.com/office/word/2020/wordml/sdtdatahash" xmlns:w16sdtfl="http://schemas.microsoft.com/office/word/2024/wordml/sdtformatlock" xmlns:w16se="http://schemas.microsoft.com/office/word/2015/wordml/symex" xmlns:wpg="http://schemas.microsoft.com/office/word/2010/wordprocessingGroup" xmlns:wpi="http://schemas.microsoft.com/office/word/2010/wordprocessingInk" xmlns:wne="http://schemas.microsoft.com/office/word/2006/wordml" xmlns:wps="http://schemas.microsoft.com/office/word/2010/wordprocessingShape" mc:Ignorable="w14 w15 w16se w16cid w16 w16cex w16sdtdh w16sdtfl w16du wp14">
+<w:document xmlns:wpc="http://schemas.microsoft.com/office/word/2010/wordprocessingCanvas" xmlns:cx="http://schemas.microsoft.com/office/drawing/2014/chartex" xmlns:cx1="http://schemas.microsoft.com/office/drawing/2015/9/8/chartex" xmlns:cx2="http://schemas.microsoft.com/office/drawing/2015/10/21/chartex" xmlns:cx3="http://schemas.microsoft.com/office/drawing/2016/5/9/chartex" xmlns:cx4="http://schemas.microsoft.com/office/drawing/2016/5/10/chartex" xmlns:cx5="http://schemas.microsoft.com/office/drawing/2016/5/11/chartex" xmlns:cx6="http://schemas.microsoft.com/office/drawing/2016/5/12/chartex" xmlns:cx7="http://schemas.microsoft.com/office/drawing/2016/5/13/chartex" xmlns:cx8="http://schemas.microsoft.com/office/drawing/2016/5/14/chartex" xmlns:mc="http://schemas.openxmlformats.org/markup-compatibility/2006" xmlns:aink="http://schemas.microsoft.com/office/drawing/2016/ink" xmlns:am3d="http://schemas.microsoft.com/office/drawing/2017/model3d" xmlns:o="urn:schemas-microsoft-com:office:office" xmlns:oel="http://schemas.microsoft.com/office/2019/extlst" xmlns:r="http://schemas.openxmlformats.org/officeDocument/2006/relationships" xmlns:m="http://schemas.openxmlformats.org/officeDocument/2006/math" xmlns:v="urn:schemas-microsoft-com:vml" xmlns:wp14="http://schemas.microsoft.com/office/word/2010/wordprocessingDrawing" xmlns:wp="http://schemas.openxmlformats.org/drawingml/2006/wordprocessingDrawing" xmlns:w10="urn:schemas-microsoft-com:office:word" xmlns:w="http://schemas.openxmlformats.org/wordprocessingml/2006/main" xmlns:w14="http://schemas.microsoft.com/office/word/2010/wordml" xmlns:w15="http://schemas.microsoft.com/office/word/2012/wordml" xmlns:w16cex="http://schemas.microsoft.com/office/word/2018/wordml/cex" xmlns:w16cid="http://schemas.microsoft.com/office/word/2016/wordml/cid" xmlns:w16="http://schemas.microsoft.com/office/word/2018/wordml" xmlns:w16du="http://schemas.microsoft.com/office/word/2023/wordml/word16du" xmlns:w16sdtdh="http://schemas.microsoft.com/office/word/2020/wordml/sdtdatahash" xmlns:w16se="http://schemas.microsoft.com/office/word/2015/wordml/symex" xmlns:wpg="http://schemas.microsoft.com/office/word/2010/wordprocessingGroup" xmlns:wpi="http://schemas.microsoft.com/office/word/2010/wordprocessingInk" xmlns:wne="http://schemas.microsoft.com/office/word/2006/wordml" xmlns:wps="http://schemas.microsoft.com/office/word/2010/wordprocessingShape" mc:Ignorable="w14 w15 w16se w16cid w16 w16cex w16sdtdh w16du wp14">
   <w:background w:color="FFFFFF"/>
   <w:body>
     <w:tbl>
@@ -29,9 +29,15 @@
               <w:pStyle w:val="Title"/>
               <w:spacing w:after="0"/>
               <w:jc w:val="center"/>
+              <w:rPr>
+                <w:color w:val="FFFFFF" w:themeColor="background1"/>
+              </w:rPr>
             </w:pPr>
             <w:r>
-              <w:t>Write a letter to request housing accommodations for a person with a disability.</w:t>
+              <w:rPr>
+                <w:color w:val="FFFFFF" w:themeColor="background1"/>
+              </w:rPr>
+              <w:t>Write a letter to request housing accommodations for a person with a disability</w:t>
             </w:r>
           </w:p>
         </w:tc>
@@ -535,11 +541,9 @@
       <w:r>
         <w:t xml:space="preserve">the response as soon as you get it. If you have questions, </w:t>
       </w:r>
-      <w:proofErr w:type="spellStart"/>
       <w:r>
         <w:t>MassLegalHelp</w:t>
       </w:r>
-      <w:proofErr w:type="spellEnd"/>
       <w:r>
         <w:t xml:space="preserve"> may be able to help you more.</w:t>
       </w:r>
@@ -636,7 +640,7 @@
 </file>
 
 <file path=word/endnotes.xml><?xml version="1.0" encoding="utf-8"?>
-<w:endnotes xmlns:wpc="http://schemas.microsoft.com/office/word/2010/wordprocessingCanvas" xmlns:cx="http://schemas.microsoft.com/office/drawing/2014/chartex" xmlns:cx1="http://schemas.microsoft.com/office/drawing/2015/9/8/chartex" xmlns:cx2="http://schemas.microsoft.com/office/drawing/2015/10/21/chartex" xmlns:cx3="http://schemas.microsoft.com/office/drawing/2016/5/9/chartex" xmlns:cx4="http://schemas.microsoft.com/office/drawing/2016/5/10/chartex" xmlns:cx5="http://schemas.microsoft.com/office/drawing/2016/5/11/chartex" xmlns:cx6="http://schemas.microsoft.com/office/drawing/2016/5/12/chartex" xmlns:cx7="http://schemas.microsoft.com/office/drawing/2016/5/13/chartex" xmlns:cx8="http://schemas.microsoft.com/office/drawing/2016/5/14/chartex" xmlns:mc="http://schemas.openxmlformats.org/markup-compatibility/2006" xmlns:aink="http://schemas.microsoft.com/office/drawing/2016/ink" xmlns:am3d="http://schemas.microsoft.com/office/drawing/2017/model3d" xmlns:o="urn:schemas-microsoft-com:office:office" xmlns:oel="http://schemas.microsoft.com/office/2019/extlst" xmlns:r="http://schemas.openxmlformats.org/officeDocument/2006/relationships" xmlns:m="http://schemas.openxmlformats.org/officeDocument/2006/math" xmlns:v="urn:schemas-microsoft-com:vml" xmlns:wp14="http://schemas.microsoft.com/office/word/2010/wordprocessingDrawing" xmlns:wp="http://schemas.openxmlformats.org/drawingml/2006/wordprocessingDrawing" xmlns:w10="urn:schemas-microsoft-com:office:word" xmlns:w="http://schemas.openxmlformats.org/wordprocessingml/2006/main" xmlns:w14="http://schemas.microsoft.com/office/word/2010/wordml" xmlns:w15="http://schemas.microsoft.com/office/word/2012/wordml" xmlns:w16cex="http://schemas.microsoft.com/office/word/2018/wordml/cex" xmlns:w16cid="http://schemas.microsoft.com/office/word/2016/wordml/cid" xmlns:w16="http://schemas.microsoft.com/office/word/2018/wordml" xmlns:w16du="http://schemas.microsoft.com/office/word/2023/wordml/word16du" xmlns:w16sdtdh="http://schemas.microsoft.com/office/word/2020/wordml/sdtdatahash" xmlns:w16sdtfl="http://schemas.microsoft.com/office/word/2024/wordml/sdtformatlock" xmlns:w16se="http://schemas.microsoft.com/office/word/2015/wordml/symex" xmlns:wpg="http://schemas.microsoft.com/office/word/2010/wordprocessingGroup" xmlns:wpi="http://schemas.microsoft.com/office/word/2010/wordprocessingInk" xmlns:wne="http://schemas.microsoft.com/office/word/2006/wordml" xmlns:wps="http://schemas.microsoft.com/office/word/2010/wordprocessingShape" mc:Ignorable="w14 w15 w16se w16cid w16 w16cex w16sdtdh w16sdtfl w16du wp14">
+<w:endnotes xmlns:wpc="http://schemas.microsoft.com/office/word/2010/wordprocessingCanvas" xmlns:cx="http://schemas.microsoft.com/office/drawing/2014/chartex" xmlns:cx1="http://schemas.microsoft.com/office/drawing/2015/9/8/chartex" xmlns:cx2="http://schemas.microsoft.com/office/drawing/2015/10/21/chartex" xmlns:cx3="http://schemas.microsoft.com/office/drawing/2016/5/9/chartex" xmlns:cx4="http://schemas.microsoft.com/office/drawing/2016/5/10/chartex" xmlns:cx5="http://schemas.microsoft.com/office/drawing/2016/5/11/chartex" xmlns:cx6="http://schemas.microsoft.com/office/drawing/2016/5/12/chartex" xmlns:cx7="http://schemas.microsoft.com/office/drawing/2016/5/13/chartex" xmlns:cx8="http://schemas.microsoft.com/office/drawing/2016/5/14/chartex" xmlns:mc="http://schemas.openxmlformats.org/markup-compatibility/2006" xmlns:aink="http://schemas.microsoft.com/office/drawing/2016/ink" xmlns:am3d="http://schemas.microsoft.com/office/drawing/2017/model3d" xmlns:o="urn:schemas-microsoft-com:office:office" xmlns:oel="http://schemas.microsoft.com/office/2019/extlst" xmlns:r="http://schemas.openxmlformats.org/officeDocument/2006/relationships" xmlns:m="http://schemas.openxmlformats.org/officeDocument/2006/math" xmlns:v="urn:schemas-microsoft-com:vml" xmlns:wp14="http://schemas.microsoft.com/office/word/2010/wordprocessingDrawing" xmlns:wp="http://schemas.openxmlformats.org/drawingml/2006/wordprocessingDrawing" xmlns:w10="urn:schemas-microsoft-com:office:word" xmlns:w="http://schemas.openxmlformats.org/wordprocessingml/2006/main" xmlns:w14="http://schemas.microsoft.com/office/word/2010/wordml" xmlns:w15="http://schemas.microsoft.com/office/word/2012/wordml" xmlns:w16cex="http://schemas.microsoft.com/office/word/2018/wordml/cex" xmlns:w16cid="http://schemas.microsoft.com/office/word/2016/wordml/cid" xmlns:w16="http://schemas.microsoft.com/office/word/2018/wordml" xmlns:w16du="http://schemas.microsoft.com/office/word/2023/wordml/word16du" xmlns:w16sdtdh="http://schemas.microsoft.com/office/word/2020/wordml/sdtdatahash" xmlns:w16se="http://schemas.microsoft.com/office/word/2015/wordml/symex" xmlns:wpg="http://schemas.microsoft.com/office/word/2010/wordprocessingGroup" xmlns:wpi="http://schemas.microsoft.com/office/word/2010/wordprocessingInk" xmlns:wne="http://schemas.microsoft.com/office/word/2006/wordml" xmlns:wps="http://schemas.microsoft.com/office/word/2010/wordprocessingShape" mc:Ignorable="w14 w15 w16se w16cid w16 w16cex w16sdtdh w16du wp14">
   <w:endnote w:type="separator" w:id="-1">
     <w:p>
       <w:pPr>
@@ -661,7 +665,7 @@
 </file>
 
 <file path=word/footnotes.xml><?xml version="1.0" encoding="utf-8"?>
-<w:footnotes xmlns:wpc="http://schemas.microsoft.com/office/word/2010/wordprocessingCanvas" xmlns:cx="http://schemas.microsoft.com/office/drawing/2014/chartex" xmlns:cx1="http://schemas.microsoft.com/office/drawing/2015/9/8/chartex" xmlns:cx2="http://schemas.microsoft.com/office/drawing/2015/10/21/chartex" xmlns:cx3="http://schemas.microsoft.com/office/drawing/2016/5/9/chartex" xmlns:cx4="http://schemas.microsoft.com/office/drawing/2016/5/10/chartex" xmlns:cx5="http://schemas.microsoft.com/office/drawing/2016/5/11/chartex" xmlns:cx6="http://schemas.microsoft.com/office/drawing/2016/5/12/chartex" xmlns:cx7="http://schemas.microsoft.com/office/drawing/2016/5/13/chartex" xmlns:cx8="http://schemas.microsoft.com/office/drawing/2016/5/14/chartex" xmlns:mc="http://schemas.openxmlformats.org/markup-compatibility/2006" xmlns:aink="http://schemas.microsoft.com/office/drawing/2016/ink" xmlns:am3d="http://schemas.microsoft.com/office/drawing/2017/model3d" xmlns:o="urn:schemas-microsoft-com:office:office" xmlns:oel="http://schemas.microsoft.com/office/2019/extlst" xmlns:r="http://schemas.openxmlformats.org/officeDocument/2006/relationships" xmlns:m="http://schemas.openxmlformats.org/officeDocument/2006/math" xmlns:v="urn:schemas-microsoft-com:vml" xmlns:wp14="http://schemas.microsoft.com/office/word/2010/wordprocessingDrawing" xmlns:wp="http://schemas.openxmlformats.org/drawingml/2006/wordprocessingDrawing" xmlns:w10="urn:schemas-microsoft-com:office:word" xmlns:w="http://schemas.openxmlformats.org/wordprocessingml/2006/main" xmlns:w14="http://schemas.microsoft.com/office/word/2010/wordml" xmlns:w15="http://schemas.microsoft.com/office/word/2012/wordml" xmlns:w16cex="http://schemas.microsoft.com/office/word/2018/wordml/cex" xmlns:w16cid="http://schemas.microsoft.com/office/word/2016/wordml/cid" xmlns:w16="http://schemas.microsoft.com/office/word/2018/wordml" xmlns:w16du="http://schemas.microsoft.com/office/word/2023/wordml/word16du" xmlns:w16sdtdh="http://schemas.microsoft.com/office/word/2020/wordml/sdtdatahash" xmlns:w16sdtfl="http://schemas.microsoft.com/office/word/2024/wordml/sdtformatlock" xmlns:w16se="http://schemas.microsoft.com/office/word/2015/wordml/symex" xmlns:wpg="http://schemas.microsoft.com/office/word/2010/wordprocessingGroup" xmlns:wpi="http://schemas.microsoft.com/office/word/2010/wordprocessingInk" xmlns:wne="http://schemas.microsoft.com/office/word/2006/wordml" xmlns:wps="http://schemas.microsoft.com/office/word/2010/wordprocessingShape" mc:Ignorable="w14 w15 w16se w16cid w16 w16cex w16sdtdh w16sdtfl w16du wp14">
+<w:footnotes xmlns:wpc="http://schemas.microsoft.com/office/word/2010/wordprocessingCanvas" xmlns:cx="http://schemas.microsoft.com/office/drawing/2014/chartex" xmlns:cx1="http://schemas.microsoft.com/office/drawing/2015/9/8/chartex" xmlns:cx2="http://schemas.microsoft.com/office/drawing/2015/10/21/chartex" xmlns:cx3="http://schemas.microsoft.com/office/drawing/2016/5/9/chartex" xmlns:cx4="http://schemas.microsoft.com/office/drawing/2016/5/10/chartex" xmlns:cx5="http://schemas.microsoft.com/office/drawing/2016/5/11/chartex" xmlns:cx6="http://schemas.microsoft.com/office/drawing/2016/5/12/chartex" xmlns:cx7="http://schemas.microsoft.com/office/drawing/2016/5/13/chartex" xmlns:cx8="http://schemas.microsoft.com/office/drawing/2016/5/14/chartex" xmlns:mc="http://schemas.openxmlformats.org/markup-compatibility/2006" xmlns:aink="http://schemas.microsoft.com/office/drawing/2016/ink" xmlns:am3d="http://schemas.microsoft.com/office/drawing/2017/model3d" xmlns:o="urn:schemas-microsoft-com:office:office" xmlns:oel="http://schemas.microsoft.com/office/2019/extlst" xmlns:r="http://schemas.openxmlformats.org/officeDocument/2006/relationships" xmlns:m="http://schemas.openxmlformats.org/officeDocument/2006/math" xmlns:v="urn:schemas-microsoft-com:vml" xmlns:wp14="http://schemas.microsoft.com/office/word/2010/wordprocessingDrawing" xmlns:wp="http://schemas.openxmlformats.org/drawingml/2006/wordprocessingDrawing" xmlns:w10="urn:schemas-microsoft-com:office:word" xmlns:w="http://schemas.openxmlformats.org/wordprocessingml/2006/main" xmlns:w14="http://schemas.microsoft.com/office/word/2010/wordml" xmlns:w15="http://schemas.microsoft.com/office/word/2012/wordml" xmlns:w16cex="http://schemas.microsoft.com/office/word/2018/wordml/cex" xmlns:w16cid="http://schemas.microsoft.com/office/word/2016/wordml/cid" xmlns:w16="http://schemas.microsoft.com/office/word/2018/wordml" xmlns:w16du="http://schemas.microsoft.com/office/word/2023/wordml/word16du" xmlns:w16sdtdh="http://schemas.microsoft.com/office/word/2020/wordml/sdtdatahash" xmlns:w16se="http://schemas.microsoft.com/office/word/2015/wordml/symex" xmlns:wpg="http://schemas.microsoft.com/office/word/2010/wordprocessingGroup" xmlns:wpi="http://schemas.microsoft.com/office/word/2010/wordprocessingInk" xmlns:wne="http://schemas.microsoft.com/office/word/2006/wordml" xmlns:wps="http://schemas.microsoft.com/office/word/2010/wordprocessingShape" mc:Ignorable="w14 w15 w16se w16cid w16 w16cex w16sdtdh w16du wp14">
   <w:footnote w:type="separator" w:id="-1">
     <w:p>
       <w:pPr>
@@ -686,7 +690,7 @@
 </file>
 
 <file path=word/numbering.xml><?xml version="1.0" encoding="utf-8"?>
-<w:numbering xmlns:wpc="http://schemas.microsoft.com/office/word/2010/wordprocessingCanvas" xmlns:cx="http://schemas.microsoft.com/office/drawing/2014/chartex" xmlns:cx1="http://schemas.microsoft.com/office/drawing/2015/9/8/chartex" xmlns:cx2="http://schemas.microsoft.com/office/drawing/2015/10/21/chartex" xmlns:cx3="http://schemas.microsoft.com/office/drawing/2016/5/9/chartex" xmlns:cx4="http://schemas.microsoft.com/office/drawing/2016/5/10/chartex" xmlns:cx5="http://schemas.microsoft.com/office/drawing/2016/5/11/chartex" xmlns:cx6="http://schemas.microsoft.com/office/drawing/2016/5/12/chartex" xmlns:cx7="http://schemas.microsoft.com/office/drawing/2016/5/13/chartex" xmlns:cx8="http://schemas.microsoft.com/office/drawing/2016/5/14/chartex" xmlns:mc="http://schemas.openxmlformats.org/markup-compatibility/2006" xmlns:aink="http://schemas.microsoft.com/office/drawing/2016/ink" xmlns:am3d="http://schemas.microsoft.com/office/drawing/2017/model3d" xmlns:o="urn:schemas-microsoft-com:office:office" xmlns:oel="http://schemas.microsoft.com/office/2019/extlst" xmlns:r="http://schemas.openxmlformats.org/officeDocument/2006/relationships" xmlns:m="http://schemas.openxmlformats.org/officeDocument/2006/math" xmlns:v="urn:schemas-microsoft-com:vml" xmlns:wp14="http://schemas.microsoft.com/office/word/2010/wordprocessingDrawing" xmlns:wp="http://schemas.openxmlformats.org/drawingml/2006/wordprocessingDrawing" xmlns:w10="urn:schemas-microsoft-com:office:word" xmlns:w="http://schemas.openxmlformats.org/wordprocessingml/2006/main" xmlns:w14="http://schemas.microsoft.com/office/word/2010/wordml" xmlns:w15="http://schemas.microsoft.com/office/word/2012/wordml" xmlns:w16cex="http://schemas.microsoft.com/office/word/2018/wordml/cex" xmlns:w16cid="http://schemas.microsoft.com/office/word/2016/wordml/cid" xmlns:w16="http://schemas.microsoft.com/office/word/2018/wordml" xmlns:w16du="http://schemas.microsoft.com/office/word/2023/wordml/word16du" xmlns:w16sdtdh="http://schemas.microsoft.com/office/word/2020/wordml/sdtdatahash" xmlns:w16sdtfl="http://schemas.microsoft.com/office/word/2024/wordml/sdtformatlock" xmlns:w16se="http://schemas.microsoft.com/office/word/2015/wordml/symex" xmlns:wpg="http://schemas.microsoft.com/office/word/2010/wordprocessingGroup" xmlns:wpi="http://schemas.microsoft.com/office/word/2010/wordprocessingInk" xmlns:wne="http://schemas.microsoft.com/office/word/2006/wordml" xmlns:wps="http://schemas.microsoft.com/office/word/2010/wordprocessingShape" mc:Ignorable="w14 w15 w16se w16cid w16 w16cex w16sdtdh w16sdtfl w16du wp14">
+<w:numbering xmlns:wpc="http://schemas.microsoft.com/office/word/2010/wordprocessingCanvas" xmlns:cx="http://schemas.microsoft.com/office/drawing/2014/chartex" xmlns:cx1="http://schemas.microsoft.com/office/drawing/2015/9/8/chartex" xmlns:cx2="http://schemas.microsoft.com/office/drawing/2015/10/21/chartex" xmlns:cx3="http://schemas.microsoft.com/office/drawing/2016/5/9/chartex" xmlns:cx4="http://schemas.microsoft.com/office/drawing/2016/5/10/chartex" xmlns:cx5="http://schemas.microsoft.com/office/drawing/2016/5/11/chartex" xmlns:cx6="http://schemas.microsoft.com/office/drawing/2016/5/12/chartex" xmlns:cx7="http://schemas.microsoft.com/office/drawing/2016/5/13/chartex" xmlns:cx8="http://schemas.microsoft.com/office/drawing/2016/5/14/chartex" xmlns:mc="http://schemas.openxmlformats.org/markup-compatibility/2006" xmlns:aink="http://schemas.microsoft.com/office/drawing/2016/ink" xmlns:am3d="http://schemas.microsoft.com/office/drawing/2017/model3d" xmlns:o="urn:schemas-microsoft-com:office:office" xmlns:oel="http://schemas.microsoft.com/office/2019/extlst" xmlns:r="http://schemas.openxmlformats.org/officeDocument/2006/relationships" xmlns:m="http://schemas.openxmlformats.org/officeDocument/2006/math" xmlns:v="urn:schemas-microsoft-com:vml" xmlns:wp14="http://schemas.microsoft.com/office/word/2010/wordprocessingDrawing" xmlns:wp="http://schemas.openxmlformats.org/drawingml/2006/wordprocessingDrawing" xmlns:w10="urn:schemas-microsoft-com:office:word" xmlns:w="http://schemas.openxmlformats.org/wordprocessingml/2006/main" xmlns:w14="http://schemas.microsoft.com/office/word/2010/wordml" xmlns:w15="http://schemas.microsoft.com/office/word/2012/wordml" xmlns:w16cex="http://schemas.microsoft.com/office/word/2018/wordml/cex" xmlns:w16cid="http://schemas.microsoft.com/office/word/2016/wordml/cid" xmlns:w16="http://schemas.microsoft.com/office/word/2018/wordml" xmlns:w16du="http://schemas.microsoft.com/office/word/2023/wordml/word16du" xmlns:w16sdtdh="http://schemas.microsoft.com/office/word/2020/wordml/sdtdatahash" xmlns:w16se="http://schemas.microsoft.com/office/word/2015/wordml/symex" xmlns:wpg="http://schemas.microsoft.com/office/word/2010/wordprocessingGroup" xmlns:wpi="http://schemas.microsoft.com/office/word/2010/wordprocessingInk" xmlns:wne="http://schemas.microsoft.com/office/word/2006/wordml" xmlns:wps="http://schemas.microsoft.com/office/word/2010/wordprocessingShape" mc:Ignorable="w14 w15 w16se w16cid w16 w16cex w16sdtdh w16du wp14">
   <w:abstractNum w:abstractNumId="0" w15:restartNumberingAfterBreak="0">
     <w:nsid w:val="13F848C7"/>
     <w:multiLevelType w:val="hybridMultilevel"/>
@@ -1645,7 +1649,7 @@
 </file>
 
 <file path=word/styles.xml><?xml version="1.0" encoding="utf-8"?>
-<w:styles xmlns:mc="http://schemas.openxmlformats.org/markup-compatibility/2006" xmlns:r="http://schemas.openxmlformats.org/officeDocument/2006/relationships" xmlns:w="http://schemas.openxmlformats.org/wordprocessingml/2006/main" xmlns:w14="http://schemas.microsoft.com/office/word/2010/wordml" xmlns:w15="http://schemas.microsoft.com/office/word/2012/wordml" xmlns:w16cex="http://schemas.microsoft.com/office/word/2018/wordml/cex" xmlns:w16cid="http://schemas.microsoft.com/office/word/2016/wordml/cid" xmlns:w16="http://schemas.microsoft.com/office/word/2018/wordml" xmlns:w16du="http://schemas.microsoft.com/office/word/2023/wordml/word16du" xmlns:w16sdtdh="http://schemas.microsoft.com/office/word/2020/wordml/sdtdatahash" xmlns:w16sdtfl="http://schemas.microsoft.com/office/word/2024/wordml/sdtformatlock" xmlns:w16se="http://schemas.microsoft.com/office/word/2015/wordml/symex" mc:Ignorable="w14 w15 w16se w16cid w16 w16cex w16sdtdh w16sdtfl w16du">
+<w:styles xmlns:mc="http://schemas.openxmlformats.org/markup-compatibility/2006" xmlns:r="http://schemas.openxmlformats.org/officeDocument/2006/relationships" xmlns:w="http://schemas.openxmlformats.org/wordprocessingml/2006/main" xmlns:w14="http://schemas.microsoft.com/office/word/2010/wordml" xmlns:w15="http://schemas.microsoft.com/office/word/2012/wordml" xmlns:w16cex="http://schemas.microsoft.com/office/word/2018/wordml/cex" xmlns:w16cid="http://schemas.microsoft.com/office/word/2016/wordml/cid" xmlns:w16="http://schemas.microsoft.com/office/word/2018/wordml" xmlns:w16du="http://schemas.microsoft.com/office/word/2023/wordml/word16du" xmlns:w16sdtdh="http://schemas.microsoft.com/office/word/2020/wordml/sdtdatahash" xmlns:w16se="http://schemas.microsoft.com/office/word/2015/wordml/symex" mc:Ignorable="w14 w15 w16se w16cid w16 w16cex w16sdtdh w16du">
   <w:docDefaults>
     <w:rPrDefault>
       <w:rPr>
@@ -2249,6 +2253,7 @@
   <w:style w:type="character" w:default="1" w:styleId="DefaultParagraphFont">
     <w:name w:val="Default Paragraph Font"/>
     <w:uiPriority w:val="1"/>
+    <w:semiHidden/>
     <w:unhideWhenUsed/>
   </w:style>
   <w:style w:type="table" w:default="1" w:styleId="TableNormal">
@@ -3221,6 +3226,23 @@
 </file>
 
 <file path=customXml/item1.xml><?xml version="1.0" encoding="utf-8"?>
+<p:properties xmlns:p="http://schemas.microsoft.com/office/2006/metadata/properties" xmlns:xsi="http://www.w3.org/2001/XMLSchema-instance" xmlns:pc="http://schemas.microsoft.com/office/infopath/2007/PartnerControls">
+  <documentManagement>
+    <_activity xmlns="1f45892c-3ef0-431c-a1bb-39a750032470" xsi:nil="true"/>
+  </documentManagement>
+</p:properties>
+</file>
+
+<file path=customXml/item2.xml><?xml version="1.0" encoding="utf-8"?>
+<?mso-contentType ?>
+<FormTemplates xmlns="http://schemas.microsoft.com/sharepoint/v3/contenttype/forms">
+  <Display>DocumentLibraryForm</Display>
+  <Edit>DocumentLibraryForm</Edit>
+  <New>DocumentLibraryForm</New>
+</FormTemplates>
+</file>
+
+<file path=customXml/item3.xml><?xml version="1.0" encoding="utf-8"?>
 <ct:contentTypeSchema xmlns:ct="http://schemas.microsoft.com/office/2006/metadata/contentType" xmlns:ma="http://schemas.microsoft.com/office/2006/metadata/properties/metaAttributes" ct:_="" ma:_="" ma:contentTypeName="Document" ma:contentTypeID="0x01010008C02EB6842A874EB640DD65ED12D5CF" ma:contentTypeVersion="16" ma:contentTypeDescription="Create a new document." ma:contentTypeScope="" ma:versionID="3aee57b101f1e395f5b1fe87498cf65c">
   <xsd:schema xmlns:xsd="http://www.w3.org/2001/XMLSchema" xmlns:xs="http://www.w3.org/2001/XMLSchema" xmlns:p="http://schemas.microsoft.com/office/2006/metadata/properties" xmlns:ns3="1f45892c-3ef0-431c-a1bb-39a750032470" xmlns:ns4="0636241d-c57a-4024-819b-b74165b66945" targetNamespace="http://schemas.microsoft.com/office/2006/metadata/properties" ma:root="true" ma:fieldsID="73607b4df106e171668466f9b69f7d9a" ns3:_="" ns4:_="">
     <xsd:import namespace="1f45892c-3ef0-431c-a1bb-39a750032470"/>
@@ -3459,24 +3481,32 @@
 </ct:contentTypeSchema>
 </file>
 
-<file path=customXml/item2.xml><?xml version="1.0" encoding="utf-8"?>
-<?mso-contentType ?>
-<FormTemplates xmlns="http://schemas.microsoft.com/sharepoint/v3/contenttype/forms">
-  <Display>DocumentLibraryForm</Display>
-  <Edit>DocumentLibraryForm</Edit>
-  <New>DocumentLibraryForm</New>
-</FormTemplates>
+<file path=customXml/itemProps1.xml><?xml version="1.0" encoding="utf-8"?>
+<ds:datastoreItem xmlns:ds="http://schemas.openxmlformats.org/officeDocument/2006/customXml" ds:itemID="{FB2DABE1-B92F-4922-AB25-8386FBCCE172}">
+  <ds:schemaRefs>
+    <ds:schemaRef ds:uri="http://schemas.microsoft.com/office/2006/metadata/properties"/>
+    <ds:schemaRef ds:uri="http://purl.org/dc/terms/"/>
+    <ds:schemaRef ds:uri="http://www.w3.org/XML/1998/namespace"/>
+    <ds:schemaRef ds:uri="http://purl.org/dc/dcmitype/"/>
+    <ds:schemaRef ds:uri="http://purl.org/dc/elements/1.1/"/>
+    <ds:schemaRef ds:uri="http://schemas.openxmlformats.org/package/2006/metadata/core-properties"/>
+    <ds:schemaRef ds:uri="http://schemas.microsoft.com/office/2006/documentManagement/types"/>
+    <ds:schemaRef ds:uri="http://schemas.microsoft.com/office/infopath/2007/PartnerControls"/>
+    <ds:schemaRef ds:uri="0636241d-c57a-4024-819b-b74165b66945"/>
+    <ds:schemaRef ds:uri="1f45892c-3ef0-431c-a1bb-39a750032470"/>
+  </ds:schemaRefs>
+</ds:datastoreItem>
 </file>
 
-<file path=customXml/item3.xml><?xml version="1.0" encoding="utf-8"?>
-<p:properties xmlns:p="http://schemas.microsoft.com/office/2006/metadata/properties" xmlns:xsi="http://www.w3.org/2001/XMLSchema-instance" xmlns:pc="http://schemas.microsoft.com/office/infopath/2007/PartnerControls">
-  <documentManagement>
-    <_activity xmlns="1f45892c-3ef0-431c-a1bb-39a750032470" xsi:nil="true"/>
-  </documentManagement>
-</p:properties>
+<file path=customXml/itemProps2.xml><?xml version="1.0" encoding="utf-8"?>
+<ds:datastoreItem xmlns:ds="http://schemas.openxmlformats.org/officeDocument/2006/customXml" ds:itemID="{E43FA3C1-82EF-4F4D-AAAF-BB9C3D43F282}">
+  <ds:schemaRefs>
+    <ds:schemaRef ds:uri="http://schemas.microsoft.com/sharepoint/v3/contenttype/forms"/>
+  </ds:schemaRefs>
+</ds:datastoreItem>
 </file>
 
-<file path=customXml/itemProps1.xml><?xml version="1.0" encoding="utf-8"?>
+<file path=customXml/itemProps3.xml><?xml version="1.0" encoding="utf-8"?>
 <ds:datastoreItem xmlns:ds="http://schemas.openxmlformats.org/officeDocument/2006/customXml" ds:itemID="{59BB6A55-2913-4C81-97A8-BC639A963433}">
   <ds:schemaRefs>
     <ds:schemaRef ds:uri="http://schemas.microsoft.com/office/2006/metadata/contentType"/>
@@ -3493,29 +3523,4 @@
     <ds:schemaRef ds:uri="http://schemas.microsoft.com/internal/obd"/>
   </ds:schemaRefs>
 </ds:datastoreItem>
-</file>
-
-<file path=customXml/itemProps2.xml><?xml version="1.0" encoding="utf-8"?>
-<ds:datastoreItem xmlns:ds="http://schemas.openxmlformats.org/officeDocument/2006/customXml" ds:itemID="{E43FA3C1-82EF-4F4D-AAAF-BB9C3D43F282}">
-  <ds:schemaRefs>
-    <ds:schemaRef ds:uri="http://schemas.microsoft.com/sharepoint/v3/contenttype/forms"/>
-  </ds:schemaRefs>
-</ds:datastoreItem>
-</file>
-
-<file path=customXml/itemProps3.xml><?xml version="1.0" encoding="utf-8"?>
-<ds:datastoreItem xmlns:ds="http://schemas.openxmlformats.org/officeDocument/2006/customXml" ds:itemID="{FB2DABE1-B92F-4922-AB25-8386FBCCE172}">
-  <ds:schemaRefs>
-    <ds:schemaRef ds:uri="http://schemas.microsoft.com/office/2006/metadata/properties"/>
-    <ds:schemaRef ds:uri="http://purl.org/dc/terms/"/>
-    <ds:schemaRef ds:uri="http://www.w3.org/XML/1998/namespace"/>
-    <ds:schemaRef ds:uri="http://purl.org/dc/dcmitype/"/>
-    <ds:schemaRef ds:uri="http://purl.org/dc/elements/1.1/"/>
-    <ds:schemaRef ds:uri="http://schemas.openxmlformats.org/package/2006/metadata/core-properties"/>
-    <ds:schemaRef ds:uri="http://schemas.microsoft.com/office/2006/documentManagement/types"/>
-    <ds:schemaRef ds:uri="http://schemas.microsoft.com/office/infopath/2007/PartnerControls"/>
-    <ds:schemaRef ds:uri="0636241d-c57a-4024-819b-b74165b66945"/>
-    <ds:schemaRef ds:uri="1f45892c-3ef0-431c-a1bb-39a750032470"/>
-  </ds:schemaRefs>
-</ds:datastoreItem>
 </file>
</xml_diff>